<commit_message>
fix(sync): synchronize 8 core project items across website, report, pptx, script, and study guide
</commit_message>
<xml_diff>
--- a/docs/ALFA_Management_Theory_and_Study_Guide_v4 (1).docx
+++ b/docs/ALFA_Management_Theory_and_Study_Guide_v4 (1).docx
@@ -6612,54 +6612,13 @@
             </w:tcMar>
           </w:tcPr>
           <w:p>
-            <w:pPr>
-              <w:spacing w:after="120" w:line="360" w:lineRule="auto"/>
-            </w:pPr>
             <w:r>
-              <w:rPr>
-                <w:rFonts w:ascii="Times New Roman" w:hAnsi="Times New Roman"/>
-                <w:color w:val="000000"/>
-                <w:sz w:val="24"/>
-              </w:rPr>
               <w:t>"[Slide 15] Thank you, Member 4. I am Member 5, and I will cover Section 6, Controlling Business Performance. Controlling is the fourth function of management: monitoring actual performance, comparing it against planned standards, and taking corrective action when results fall short. Alongside Lecture 1 and Lecture 5 from Dr. Paul, we also apply the four-step control cycle and feedforward, concurrent, and feedback controls from our Robbins and Coulter textbook."</w:t>
-            </w:r>
-          </w:p>
-          <w:p>
-            <w:pPr>
-              <w:spacing w:after="120" w:line="360" w:lineRule="auto"/>
-            </w:pPr>
-            <w:r>
-              <w:rPr>
-                <w:rFonts w:ascii="Times New Roman" w:hAnsi="Times New Roman"/>
-                <w:color w:val="000000"/>
-                <w:sz w:val="24"/>
-              </w:rPr>
+              <w:br/>
               <w:t>"At ALFA, feedforward control locks required fields into our online application form and requires 95% of our 120 staff to pass the ALFA OneHub test before go-live. Concurrent control uses live traffic-light alerts inside ALFA OneHub: if a student DM waits 90 minutes, an amber alert flashes before breaking our 2-hour rule. Finally, feedback control checks monthly commission savings and quarterly recruitment channel shares after each intake."</w:t>
-            </w:r>
-          </w:p>
-          <w:p>
-            <w:pPr>
-              <w:spacing w:after="120" w:line="360" w:lineRule="auto"/>
-            </w:pPr>
-            <w:r>
-              <w:rPr>
-                <w:rFonts w:ascii="Times New Roman" w:hAnsi="Times New Roman"/>
-                <w:color w:val="000000"/>
-                <w:sz w:val="24"/>
-              </w:rPr>
+              <w:br/>
               <w:t>"[Slide 16] On Slide 16, our four-column Control Matrix tracks all five areas. First, in Financial Control, we cut agent commissions from $150,000 to $52,500 a year, saving $97,500 gross and $55,500 net after our $42,000 budget, or $65,500 net against the $160,000 total baseline. Our cost per direct student target is $161.54 across 260 direct students, and our blended cost across all 400 students is $236.25. If direct cost exceeds $175, Finance pauses weak ads and blocks any agent claim without a first timestamp. Second, Operations Control tracks our 2-hour DM reply target, 24-hour ERP turnaround for registration, exam slips, and letters, and a 90% paper cut. If wait times pass 24 hours, the Registry Supervisor reassigns queues. Third, Quality Control tracks 5 weekly reels, 20,000 Instagram followers, and a 4.5 out of 5 app rating. Fourth, HR Control tracks a 95% staff test pass rate and 100% QR attendance."</w:t>
-            </w:r>
-          </w:p>
-          <w:p>
-            <w:pPr>
-              <w:spacing w:after="40" w:line="360" w:lineRule="auto"/>
-            </w:pPr>
-            <w:r>
-              <w:rPr>
-                <w:rFonts w:ascii="Times New Roman" w:hAnsi="Times New Roman"/>
-                <w:color w:val="000000"/>
-                <w:sz w:val="24"/>
-              </w:rPr>
+              <w:br/>
               <w:t>"[Slide 17] Fifth, Strategic Control tracks our quarterly shift from 0% direct today to 20% in Quarter 1, 40% in Quarter 2, 55% in Quarter 3, and 65% direct—260 students—by Quarter 4. We calculate Variance as Actual minus Target and Achievement Percentage as Actual divided by Target times 100, triggering our $100 Early-Bird Rebate if Month 6 direct share is below 30%. Next is Member 6."</w:t>
             </w:r>
           </w:p>
@@ -7230,30 +7189,7 @@
         <w:ind w:left="360"/>
       </w:pPr>
       <w:r>
-        <w:rPr>
-          <w:rFonts w:ascii="Times New Roman" w:hAnsi="Times New Roman"/>
-          <w:b/>
-          <w:color w:val="8B0000"/>
-          <w:sz w:val="24"/>
-        </w:rPr>
-        <w:t xml:space="preserve">•  </w:t>
-      </w:r>
-      <w:r>
-        <w:rPr>
-          <w:rFonts w:ascii="Times New Roman" w:hAnsi="Times New Roman"/>
-          <w:b/>
-          <w:color w:val="000000"/>
-          <w:sz w:val="24"/>
-        </w:rPr>
-        <w:t xml:space="preserve">Formula 2 (Target Achievement Percentage Formula): </w:t>
-      </w:r>
-      <w:r>
-        <w:rPr>
-          <w:rFonts w:ascii="Times New Roman" w:hAnsi="Times New Roman"/>
-          <w:color w:val="000000"/>
-          <w:sz w:val="24"/>
-        </w:rPr>
-        <w:t>Target Achievement (%) = (Actual Performance ÷ Target Standard) × 100. Worked Example: In the Month 6 example above, Achievement (%) = (68 ÷ 80) × 100 = 85.0%. Because 85.0% is below our 90% threshold, the Marketing Director immediately shifts ad funds to top-performing TikTok reels.</w:t>
+        <w:t>•  Formula 2 (Target Achievement Percentage Formula): Target Achievement (%) = (Actual Performance ÷ Target Standard) × 100. Worked Example: In the Month 6 example above, Achievement (%) = (68 ÷ 80) × 100 = 85.0%. Under our traffic-light rule (Green ≥100%, Amber 90–99%, Red &lt;90%), because 85.0% is below our 90% threshold (Red), the Marketing Director immediately shifts ad funds to top-performing TikTok reels.</w:t>
       </w:r>
     </w:p>
     <w:tbl>

</xml_diff>